<commit_message>
Add common storefront customer account module with theme-matched UI
</commit_message>
<xml_diff>
--- a/masterrequirement.docx
+++ b/masterrequirement.docx
@@ -6459,6 +6459,1337 @@
           <w:sz-cs w:val="24"/>
         </w:rPr>
         <w:t xml:space="preserve">| Active store auto-binding | Developed | Login tenancy now returns current store id; frontend active-store hook auto-binds store context from auth/access + stores list | Multi-store explicit switch memory per user/device |</w:t>
+      </w:r>
+    </w:p>
+    <w:p>
+      <w:pPr/>
+      <w:r>
+        <w:rPr>
+          <w:rFonts w:ascii="Helvetica Light" w:hAnsi="Helvetica Light" w:cs="Helvetica Light"/>
+          <w:sz w:val="24"/>
+          <w:sz-cs w:val="24"/>
+        </w:rPr>
+        <w:t xml:space="preserve"/>
+      </w:r>
+    </w:p>
+    <w:p>
+      <w:pPr/>
+      <w:r>
+        <w:rPr>
+          <w:rFonts w:ascii="Helvetica Light" w:hAnsi="Helvetica Light" w:cs="Helvetica Light"/>
+          <w:sz w:val="24"/>
+          <w:sz-cs w:val="24"/>
+        </w:rPr>
+        <w:t xml:space="preserve">Update 2026-02-21</w:t>
+      </w:r>
+    </w:p>
+    <w:p>
+      <w:pPr/>
+      <w:r>
+        <w:rPr>
+          <w:rFonts w:ascii="Helvetica Light" w:hAnsi="Helvetica Light" w:cs="Helvetica Light"/>
+          <w:sz w:val="24"/>
+          <w:sz-cs w:val="24"/>
+        </w:rPr>
+        <w:t xml:space="preserve">- Store API hardening completed for create/update request contract.</w:t>
+      </w:r>
+    </w:p>
+    <w:p>
+      <w:pPr/>
+      <w:r>
+        <w:rPr>
+          <w:rFonts w:ascii="Helvetica Light" w:hAnsi="Helvetica Light" w:cs="Helvetica Light"/>
+          <w:sz w:val="24"/>
+          <w:sz-cs w:val="24"/>
+        </w:rPr>
+        <w:t xml:space="preserve">- Replaced entity binding with DTO contract to prevent navigation validation failures in production.</w:t>
+      </w:r>
+    </w:p>
+    <w:p>
+      <w:pPr/>
+      <w:r>
+        <w:rPr>
+          <w:rFonts w:ascii="Helvetica Light" w:hAnsi="Helvetica Light" w:cs="Helvetica Light"/>
+          <w:sz w:val="24"/>
+          <w:sz-cs w:val="24"/>
+        </w:rPr>
+        <w:t xml:space="preserve">- Store update/create now supports scalar-only payloads from frontend safely.</w:t>
+      </w:r>
+    </w:p>
+    <w:p>
+      <w:pPr/>
+      <w:r>
+        <w:rPr>
+          <w:rFonts w:ascii="Helvetica Light" w:hAnsi="Helvetica Light" w:cs="Helvetica Light"/>
+          <w:sz w:val="24"/>
+          <w:sz-cs w:val="24"/>
+        </w:rPr>
+        <w:t xml:space="preserve"/>
+      </w:r>
+    </w:p>
+    <w:p>
+      <w:pPr/>
+      <w:r>
+        <w:rPr>
+          <w:rFonts w:ascii="Helvetica Light" w:hAnsi="Helvetica Light" w:cs="Helvetica Light"/>
+          <w:sz w:val="24"/>
+          <w:sz-cs w:val="24"/>
+        </w:rPr>
+        <w:t xml:space="preserve">Update 2026-02-21</w:t>
+      </w:r>
+    </w:p>
+    <w:p>
+      <w:pPr/>
+      <w:r>
+        <w:rPr>
+          <w:rFonts w:ascii="Helvetica Light" w:hAnsi="Helvetica Light" w:cs="Helvetica Light"/>
+          <w:sz w:val="24"/>
+          <w:sz-cs w:val="24"/>
+        </w:rPr>
+        <w:t xml:space="preserve">- Store update/create validation hardened for required store name.</w:t>
+      </w:r>
+    </w:p>
+    <w:p>
+      <w:pPr/>
+      <w:r>
+        <w:rPr>
+          <w:rFonts w:ascii="Helvetica Light" w:hAnsi="Helvetica Light" w:cs="Helvetica Light"/>
+          <w:sz w:val="24"/>
+          <w:sz-cs w:val="24"/>
+        </w:rPr>
+        <w:t xml:space="preserve">- Prevents 500 errors on malformed payloads; returns API-safe 400 validation error.</w:t>
+      </w:r>
+    </w:p>
+    <w:p>
+      <w:pPr/>
+      <w:r>
+        <w:rPr>
+          <w:rFonts w:ascii="Helvetica Light" w:hAnsi="Helvetica Light" w:cs="Helvetica Light"/>
+          <w:sz w:val="24"/>
+          <w:sz-cs w:val="24"/>
+        </w:rPr>
+        <w:t xml:space="preserve"/>
+      </w:r>
+    </w:p>
+    <w:p>
+      <w:pPr/>
+      <w:r>
+        <w:rPr>
+          <w:rFonts w:ascii="Helvetica Light" w:hAnsi="Helvetica Light" w:cs="Helvetica Light"/>
+          <w:sz w:val="24"/>
+          <w:sz-cs w:val="24"/>
+        </w:rPr>
+        <w:t xml:space="preserve">Update 2026-02-21</w:t>
+      </w:r>
+    </w:p>
+    <w:p>
+      <w:pPr/>
+      <w:r>
+        <w:rPr>
+          <w:rFonts w:ascii="Helvetica Light" w:hAnsi="Helvetica Light" w:cs="Helvetica Light"/>
+          <w:sz w:val="24"/>
+          <w:sz-cs w:val="24"/>
+        </w:rPr>
+        <w:t xml:space="preserve">- Store settings save flow hardened: external DNS provisioning errors no longer block store updates.</w:t>
+      </w:r>
+    </w:p>
+    <w:p>
+      <w:pPr/>
+      <w:r>
+        <w:rPr>
+          <w:rFonts w:ascii="Helvetica Light" w:hAnsi="Helvetica Light" w:cs="Helvetica Light"/>
+          <w:sz w:val="24"/>
+          <w:sz-cs w:val="24"/>
+        </w:rPr>
+        <w:t xml:space="preserve">- API now returns structured failures for easier frontend handling.</w:t>
+      </w:r>
+    </w:p>
+    <w:p>
+      <w:pPr/>
+      <w:r>
+        <w:rPr>
+          <w:rFonts w:ascii="Helvetica Light" w:hAnsi="Helvetica Light" w:cs="Helvetica Light"/>
+          <w:sz w:val="24"/>
+          <w:sz-cs w:val="24"/>
+        </w:rPr>
+        <w:t xml:space="preserve"/>
+      </w:r>
+    </w:p>
+    <w:p>
+      <w:pPr/>
+      <w:r>
+        <w:rPr>
+          <w:rFonts w:ascii="Helvetica Light" w:hAnsi="Helvetica Light" w:cs="Helvetica Light"/>
+          <w:sz w:val="24"/>
+          <w:sz-cs w:val="24"/>
+        </w:rPr>
+        <w:t xml:space="preserve">Update 2026-02-21</w:t>
+      </w:r>
+    </w:p>
+    <w:p>
+      <w:pPr/>
+      <w:r>
+        <w:rPr>
+          <w:rFonts w:ascii="Helvetica Light" w:hAnsi="Helvetica Light" w:cs="Helvetica Light"/>
+          <w:sz w:val="24"/>
+          <w:sz-cs w:val="24"/>
+        </w:rPr>
+        <w:t xml:space="preserve">- Added default production frontend origin fallback in CORS registry (`https://sitesellr-web.onrender.com`).</w:t>
+      </w:r>
+    </w:p>
+    <w:p>
+      <w:pPr/>
+      <w:r>
+        <w:rPr>
+          <w:rFonts w:ascii="Helvetica Light" w:hAnsi="Helvetica Light" w:cs="Helvetica Light"/>
+          <w:sz w:val="24"/>
+          <w:sz-cs w:val="24"/>
+        </w:rPr>
+        <w:t xml:space="preserve">- Added origin normalization to reduce configuration mismatch errors.</w:t>
+      </w:r>
+    </w:p>
+    <w:p>
+      <w:pPr/>
+      <w:r>
+        <w:rPr>
+          <w:rFonts w:ascii="Helvetica Light" w:hAnsi="Helvetica Light" w:cs="Helvetica Light"/>
+          <w:sz w:val="24"/>
+          <w:sz-cs w:val="24"/>
+        </w:rPr>
+        <w:t xml:space="preserve"/>
+      </w:r>
+    </w:p>
+    <w:p>
+      <w:pPr/>
+      <w:r>
+        <w:rPr>
+          <w:rFonts w:ascii="Helvetica Light" w:hAnsi="Helvetica Light" w:cs="Helvetica Light"/>
+          <w:sz w:val="24"/>
+          <w:sz-cs w:val="24"/>
+        </w:rPr>
+        <w:t xml:space="preserve">Update 2026-02-21</w:t>
+      </w:r>
+    </w:p>
+    <w:p>
+      <w:pPr/>
+      <w:r>
+        <w:rPr>
+          <w:rFonts w:ascii="Helvetica Light" w:hAnsi="Helvetica Light" w:cs="Helvetica Light"/>
+          <w:sz w:val="24"/>
+          <w:sz-cs w:val="24"/>
+        </w:rPr>
+        <w:t xml:space="preserve">- Product media flow hardened: image optimization is best-effort and no longer blocks product save.</w:t>
+      </w:r>
+    </w:p>
+    <w:p>
+      <w:pPr/>
+      <w:r>
+        <w:rPr>
+          <w:rFonts w:ascii="Helvetica Light" w:hAnsi="Helvetica Light" w:cs="Helvetica Light"/>
+          <w:sz w:val="24"/>
+          <w:sz-cs w:val="24"/>
+        </w:rPr>
+        <w:t xml:space="preserve">- Mixed media mode (uploaded images + URL images + optional video URL) is now stable in save flow.</w:t>
+      </w:r>
+    </w:p>
+    <w:p>
+      <w:pPr/>
+      <w:r>
+        <w:rPr>
+          <w:rFonts w:ascii="Helvetica Light" w:hAnsi="Helvetica Light" w:cs="Helvetica Light"/>
+          <w:sz w:val="24"/>
+          <w:sz-cs w:val="24"/>
+        </w:rPr>
+        <w:t xml:space="preserve"/>
+      </w:r>
+    </w:p>
+    <w:p>
+      <w:pPr/>
+      <w:r>
+        <w:rPr>
+          <w:rFonts w:ascii="Helvetica Light" w:hAnsi="Helvetica Light" w:cs="Helvetica Light"/>
+          <w:sz w:val="24"/>
+          <w:sz-cs w:val="24"/>
+        </w:rPr>
+        <w:t xml:space="preserve">Update 2026-02-21</w:t>
+      </w:r>
+    </w:p>
+    <w:p>
+      <w:pPr/>
+      <w:r>
+        <w:rPr>
+          <w:rFonts w:ascii="Helvetica Light" w:hAnsi="Helvetica Light" w:cs="Helvetica Light"/>
+          <w:sz w:val="24"/>
+          <w:sz-cs w:val="24"/>
+        </w:rPr>
+        <w:t xml:space="preserve">- Product create API hardened against nested variant/media key collision and raw graph attach issues.</w:t>
+      </w:r>
+    </w:p>
+    <w:p>
+      <w:pPr/>
+      <w:r>
+        <w:rPr>
+          <w:rFonts w:ascii="Helvetica Light" w:hAnsi="Helvetica Light" w:cs="Helvetica Light"/>
+          <w:sz w:val="24"/>
+          <w:sz-cs w:val="24"/>
+        </w:rPr>
+        <w:t xml:space="preserve">- API now emits structured error payloads for create failures.</w:t>
+      </w:r>
+    </w:p>
+    <w:p>
+      <w:pPr/>
+      <w:r>
+        <w:rPr>
+          <w:rFonts w:ascii="Helvetica Light" w:hAnsi="Helvetica Light" w:cs="Helvetica Light"/>
+          <w:sz w:val="24"/>
+          <w:sz-cs w:val="24"/>
+        </w:rPr>
+        <w:t xml:space="preserve"/>
+      </w:r>
+    </w:p>
+    <w:p>
+      <w:pPr/>
+      <w:r>
+        <w:rPr>
+          <w:rFonts w:ascii="Helvetica Light" w:hAnsi="Helvetica Light" w:cs="Helvetica Light"/>
+          <w:sz w:val="24"/>
+          <w:sz-cs w:val="24"/>
+        </w:rPr>
+        <w:t xml:space="preserve">Update 2026-02-21</w:t>
+      </w:r>
+    </w:p>
+    <w:p>
+      <w:pPr/>
+      <w:r>
+        <w:rPr>
+          <w:rFonts w:ascii="Helvetica Light" w:hAnsi="Helvetica Light" w:cs="Helvetica Light"/>
+          <w:sz w:val="24"/>
+          <w:sz-cs w:val="24"/>
+        </w:rPr>
+        <w:t xml:space="preserve">- Login UX now surfaces precise auth failure reasons to reduce production debugging time.</w:t>
+      </w:r>
+    </w:p>
+    <w:p>
+      <w:pPr/>
+      <w:r>
+        <w:rPr>
+          <w:rFonts w:ascii="Helvetica Light" w:hAnsi="Helvetica Light" w:cs="Helvetica Light"/>
+          <w:sz w:val="24"/>
+          <w:sz-cs w:val="24"/>
+        </w:rPr>
+        <w:t xml:space="preserve"/>
+      </w:r>
+    </w:p>
+    <w:p>
+      <w:pPr/>
+      <w:r>
+        <w:rPr>
+          <w:rFonts w:ascii="Helvetica Light" w:hAnsi="Helvetica Light" w:cs="Helvetica Light"/>
+          <w:sz w:val="24"/>
+          <w:sz-cs w:val="24"/>
+        </w:rPr>
+        <w:t xml:space="preserve">Update 2026-02-21</w:t>
+      </w:r>
+    </w:p>
+    <w:p>
+      <w:pPr/>
+      <w:r>
+        <w:rPr>
+          <w:rFonts w:ascii="Helvetica Light" w:hAnsi="Helvetica Light" w:cs="Helvetica Light"/>
+          <w:sz w:val="24"/>
+          <w:sz-cs w:val="24"/>
+        </w:rPr>
+        <w:t xml:space="preserve">- Added global API exception handling with CORS-preserving error responses for cross-origin deployments.</w:t>
+      </w:r>
+    </w:p>
+    <w:p>
+      <w:pPr/>
+      <w:r>
+        <w:rPr>
+          <w:rFonts w:ascii="Helvetica Light" w:hAnsi="Helvetica Light" w:cs="Helvetica Light"/>
+          <w:sz w:val="24"/>
+          <w:sz-cs w:val="24"/>
+        </w:rPr>
+        <w:t xml:space="preserve"/>
+      </w:r>
+    </w:p>
+    <w:p>
+      <w:pPr/>
+      <w:r>
+        <w:rPr>
+          <w:rFonts w:ascii="Helvetica Light" w:hAnsi="Helvetica Light" w:cs="Helvetica Light"/>
+          <w:sz w:val="24"/>
+          <w:sz-cs w:val="24"/>
+        </w:rPr>
+        <w:t xml:space="preserve">Update 2026-02-21</w:t>
+      </w:r>
+    </w:p>
+    <w:p>
+      <w:pPr/>
+      <w:r>
+        <w:rPr>
+          <w:rFonts w:ascii="Helvetica Light" w:hAnsi="Helvetica Light" w:cs="Helvetica Light"/>
+          <w:sz w:val="24"/>
+          <w:sz-cs w:val="24"/>
+        </w:rPr>
+        <w:t xml:space="preserve">- Added production auth middleware wiring for opaque bearer tokens to support all `[Authorize]` APIs correctly.</w:t>
+      </w:r>
+    </w:p>
+    <w:p>
+      <w:pPr/>
+      <w:r>
+        <w:rPr>
+          <w:rFonts w:ascii="Helvetica Light" w:hAnsi="Helvetica Light" w:cs="Helvetica Light"/>
+          <w:sz w:val="24"/>
+          <w:sz-cs w:val="24"/>
+        </w:rPr>
+        <w:t xml:space="preserve"/>
+      </w:r>
+    </w:p>
+    <w:p>
+      <w:pPr/>
+      <w:r>
+        <w:rPr>
+          <w:rFonts w:ascii="Helvetica Light" w:hAnsi="Helvetica Light" w:cs="Helvetica Light"/>
+          <w:sz w:val="24"/>
+          <w:sz-cs w:val="24"/>
+        </w:rPr>
+        <w:t xml:space="preserve">Update 2026-02-21</w:t>
+      </w:r>
+    </w:p>
+    <w:p>
+      <w:pPr/>
+      <w:r>
+        <w:rPr>
+          <w:rFonts w:ascii="Helvetica Light" w:hAnsi="Helvetica Light" w:cs="Helvetica Light"/>
+          <w:sz w:val="24"/>
+          <w:sz-cs w:val="24"/>
+        </w:rPr>
+        <w:t xml:space="preserve">- Fixed RBAC compatibility gap causing false 403 on store-owner product endpoints.</w:t>
+      </w:r>
+    </w:p>
+    <w:p>
+      <w:pPr/>
+      <w:r>
+        <w:rPr>
+          <w:rFonts w:ascii="Helvetica Light" w:hAnsi="Helvetica Light" w:cs="Helvetica Light"/>
+          <w:sz w:val="24"/>
+          <w:sz-cs w:val="24"/>
+        </w:rPr>
+        <w:t xml:space="preserve"/>
+      </w:r>
+    </w:p>
+    <w:p>
+      <w:pPr/>
+      <w:r>
+        <w:rPr>
+          <w:rFonts w:ascii="Helvetica Light" w:hAnsi="Helvetica Light" w:cs="Helvetica Light"/>
+          <w:sz w:val="24"/>
+          <w:sz-cs w:val="24"/>
+        </w:rPr>
+        <w:t xml:space="preserve">Update 2026-02-21</w:t>
+      </w:r>
+    </w:p>
+    <w:p>
+      <w:pPr/>
+      <w:r>
+        <w:rPr>
+          <w:rFonts w:ascii="Helvetica Light" w:hAnsi="Helvetica Light" w:cs="Helvetica Light"/>
+          <w:sz w:val="24"/>
+          <w:sz-cs w:val="24"/>
+        </w:rPr>
+        <w:t xml:space="preserve">- Stores API stabilized with DTO output contract and guarded list handler.</w:t>
+      </w:r>
+    </w:p>
+    <w:p>
+      <w:pPr/>
+      <w:r>
+        <w:rPr>
+          <w:rFonts w:ascii="Helvetica Light" w:hAnsi="Helvetica Light" w:cs="Helvetica Light"/>
+          <w:sz w:val="24"/>
+          <w:sz-cs w:val="24"/>
+        </w:rPr>
+        <w:t xml:space="preserve"/>
+      </w:r>
+    </w:p>
+    <w:p>
+      <w:pPr/>
+      <w:r>
+        <w:rPr>
+          <w:rFonts w:ascii="Helvetica Light" w:hAnsi="Helvetica Light" w:cs="Helvetica Light"/>
+          <w:sz w:val="24"/>
+          <w:sz-cs w:val="24"/>
+        </w:rPr>
+        <w:t xml:space="preserve">Update 2026-02-21</w:t>
+      </w:r>
+    </w:p>
+    <w:p>
+      <w:pPr/>
+      <w:r>
+        <w:rPr>
+          <w:rFonts w:ascii="Helvetica Light" w:hAnsi="Helvetica Light" w:cs="Helvetica Light"/>
+          <w:sz w:val="24"/>
+          <w:sz-cs w:val="24"/>
+        </w:rPr>
+        <w:t xml:space="preserve">- Tenancy resolution now fails open for domain lookup errors to keep core authenticated APIs operational.</w:t>
+      </w:r>
+    </w:p>
+    <w:p>
+      <w:pPr/>
+      <w:r>
+        <w:rPr>
+          <w:rFonts w:ascii="Helvetica Light" w:hAnsi="Helvetica Light" w:cs="Helvetica Light"/>
+          <w:sz w:val="24"/>
+          <w:sz-cs w:val="24"/>
+        </w:rPr>
+        <w:t xml:space="preserve"/>
+      </w:r>
+    </w:p>
+    <w:p>
+      <w:pPr/>
+      <w:r>
+        <w:rPr>
+          <w:rFonts w:ascii="Helvetica Light" w:hAnsi="Helvetica Light" w:cs="Helvetica Light"/>
+          <w:sz w:val="24"/>
+          <w:sz-cs w:val="24"/>
+        </w:rPr>
+        <w:t xml:space="preserve">Update 2026-02-21</w:t>
+      </w:r>
+    </w:p>
+    <w:p>
+      <w:pPr/>
+      <w:r>
+        <w:rPr>
+          <w:rFonts w:ascii="Helvetica Light" w:hAnsi="Helvetica Light" w:cs="Helvetica Light"/>
+          <w:sz w:val="24"/>
+          <w:sz-cs w:val="24"/>
+        </w:rPr>
+        <w:t xml:space="preserve">- Category/product API contracts hardened with DTO mapping to prevent navigation validation and cyclic JSON serialization failures.</w:t>
+      </w:r>
+    </w:p>
+    <w:p>
+      <w:pPr/>
+      <w:r>
+        <w:rPr>
+          <w:rFonts w:ascii="Helvetica Light" w:hAnsi="Helvetica Light" w:cs="Helvetica Light"/>
+          <w:sz w:val="24"/>
+          <w:sz-cs w:val="24"/>
+        </w:rPr>
+        <w:t xml:space="preserve"/>
+      </w:r>
+    </w:p>
+    <w:p>
+      <w:pPr/>
+      <w:r>
+        <w:rPr>
+          <w:rFonts w:ascii="Helvetica Light" w:hAnsi="Helvetica Light" w:cs="Helvetica Light"/>
+          <w:sz w:val="24"/>
+          <w:sz-cs w:val="24"/>
+        </w:rPr>
+        <w:t xml:space="preserve">Update 2026-02-21</w:t>
+      </w:r>
+    </w:p>
+    <w:p>
+      <w:pPr/>
+      <w:r>
+        <w:rPr>
+          <w:rFonts w:ascii="Helvetica Light" w:hAnsi="Helvetica Light" w:cs="Helvetica Light"/>
+          <w:sz w:val="24"/>
+          <w:sz-cs w:val="24"/>
+        </w:rPr>
+        <w:t xml:space="preserve">- Security package maintenance: ImageSharp upgraded to reduce dependency vulnerability warnings in CI/deploy.</w:t>
+      </w:r>
+    </w:p>
+    <w:p>
+      <w:pPr/>
+      <w:r>
+        <w:rPr>
+          <w:rFonts w:ascii="Helvetica Light" w:hAnsi="Helvetica Light" w:cs="Helvetica Light"/>
+          <w:sz w:val="24"/>
+          <w:sz-cs w:val="24"/>
+        </w:rPr>
+        <w:t xml:space="preserve"/>
+      </w:r>
+    </w:p>
+    <w:p>
+      <w:pPr/>
+      <w:r>
+        <w:rPr>
+          <w:rFonts w:ascii="Helvetica Light" w:hAnsi="Helvetica Light" w:cs="Helvetica Light"/>
+          <w:sz w:val="24"/>
+          <w:sz-cs w:val="24"/>
+        </w:rPr>
+        <w:t xml:space="preserve">Update 2026-02-21</w:t>
+      </w:r>
+    </w:p>
+    <w:p>
+      <w:pPr/>
+      <w:r>
+        <w:rPr>
+          <w:rFonts w:ascii="Helvetica Light" w:hAnsi="Helvetica Light" w:cs="Helvetica Light"/>
+          <w:sz w:val="24"/>
+          <w:sz-cs w:val="24"/>
+        </w:rPr>
+        <w:t xml:space="preserve">- Fixed product DTO compile regression that was blocking container publish.</w:t>
+      </w:r>
+    </w:p>
+    <w:p>
+      <w:pPr/>
+      <w:r>
+        <w:rPr>
+          <w:rFonts w:ascii="Helvetica Light" w:hAnsi="Helvetica Light" w:cs="Helvetica Light"/>
+          <w:sz w:val="24"/>
+          <w:sz-cs w:val="24"/>
+        </w:rPr>
+        <w:t xml:space="preserve"/>
+      </w:r>
+    </w:p>
+    <w:p>
+      <w:pPr/>
+      <w:r>
+        <w:rPr>
+          <w:rFonts w:ascii="Helvetica Light" w:hAnsi="Helvetica Light" w:cs="Helvetica Light"/>
+          <w:sz w:val="24"/>
+          <w:sz-cs w:val="24"/>
+        </w:rPr>
+        <w:t xml:space="preserve">Update 2026-02-21</w:t>
+      </w:r>
+    </w:p>
+    <w:p>
+      <w:pPr/>
+      <w:r>
+        <w:rPr>
+          <w:rFonts w:ascii="Helvetica Light" w:hAnsi="Helvetica Light" w:cs="Helvetica Light"/>
+          <w:sz w:val="24"/>
+          <w:sz-cs w:val="24"/>
+        </w:rPr>
+        <w:t xml:space="preserve">- Dependency update: ImageSharp raised to 3.1.11.</w:t>
+      </w:r>
+    </w:p>
+    <w:p>
+      <w:pPr/>
+      <w:r>
+        <w:rPr>
+          <w:rFonts w:ascii="Helvetica Light" w:hAnsi="Helvetica Light" w:cs="Helvetica Light"/>
+          <w:sz w:val="24"/>
+          <w:sz-cs w:val="24"/>
+        </w:rPr>
+        <w:t xml:space="preserve"/>
+      </w:r>
+    </w:p>
+    <w:p>
+      <w:pPr/>
+      <w:r>
+        <w:rPr>
+          <w:rFonts w:ascii="Helvetica Light" w:hAnsi="Helvetica Light" w:cs="Helvetica Light"/>
+          <w:sz w:val="24"/>
+          <w:sz-cs w:val="24"/>
+        </w:rPr>
+        <w:t xml:space="preserve">Update 2026-02-21</w:t>
+      </w:r>
+    </w:p>
+    <w:p>
+      <w:pPr/>
+      <w:r>
+        <w:rPr>
+          <w:rFonts w:ascii="Helvetica Light" w:hAnsi="Helvetica Light" w:cs="Helvetica Light"/>
+          <w:sz w:val="24"/>
+          <w:sz-cs w:val="24"/>
+        </w:rPr>
+        <w:t xml:space="preserve">- Category module API reliability improved with exception-safe handlers and flat DTO responses.</w:t>
+      </w:r>
+    </w:p>
+    <w:p>
+      <w:pPr/>
+      <w:r>
+        <w:rPr>
+          <w:rFonts w:ascii="Helvetica Light" w:hAnsi="Helvetica Light" w:cs="Helvetica Light"/>
+          <w:sz w:val="24"/>
+          <w:sz-cs w:val="24"/>
+        </w:rPr>
+        <w:t xml:space="preserve"/>
+      </w:r>
+    </w:p>
+    <w:p>
+      <w:pPr/>
+      <w:r>
+        <w:rPr>
+          <w:rFonts w:ascii="Helvetica Light" w:hAnsi="Helvetica Light" w:cs="Helvetica Light"/>
+          <w:sz w:val="24"/>
+          <w:sz-cs w:val="24"/>
+        </w:rPr>
+        <w:t xml:space="preserve">Update 2026-02-21</w:t>
+      </w:r>
+    </w:p>
+    <w:p>
+      <w:pPr/>
+      <w:r>
+        <w:rPr>
+          <w:rFonts w:ascii="Helvetica Light" w:hAnsi="Helvetica Light" w:cs="Helvetica Light"/>
+          <w:sz w:val="24"/>
+          <w:sz-cs w:val="24"/>
+        </w:rPr>
+        <w:t xml:space="preserve">- Product presentation and Orders module wiring stabilized via response DTOs and media/category mapping fixes.</w:t>
+      </w:r>
+    </w:p>
+    <w:p>
+      <w:pPr/>
+      <w:r>
+        <w:rPr>
+          <w:rFonts w:ascii="Helvetica Light" w:hAnsi="Helvetica Light" w:cs="Helvetica Light"/>
+          <w:sz w:val="24"/>
+          <w:sz-cs w:val="24"/>
+        </w:rPr>
+        <w:t xml:space="preserve"/>
+      </w:r>
+    </w:p>
+    <w:p>
+      <w:pPr/>
+      <w:r>
+        <w:rPr>
+          <w:rFonts w:ascii="Helvetica Light" w:hAnsi="Helvetica Light" w:cs="Helvetica Light"/>
+          <w:sz w:val="24"/>
+          <w:sz-cs w:val="24"/>
+        </w:rPr>
+        <w:t xml:space="preserve">Update 2026-02-21</w:t>
+      </w:r>
+    </w:p>
+    <w:p>
+      <w:pPr/>
+      <w:r>
+        <w:rPr>
+          <w:rFonts w:ascii="Helvetica Light" w:hAnsi="Helvetica Light" w:cs="Helvetica Light"/>
+          <w:sz w:val="24"/>
+          <w:sz-cs w:val="24"/>
+        </w:rPr>
+        <w:t xml:space="preserve">- Implemented India-wide state catalog in backend and integrated modern address-aware storefront checkout UX.</w:t>
+      </w:r>
+    </w:p>
+    <w:p>
+      <w:pPr/>
+      <w:r>
+        <w:rPr>
+          <w:rFonts w:ascii="Helvetica Light" w:hAnsi="Helvetica Light" w:cs="Helvetica Light"/>
+          <w:sz w:val="24"/>
+          <w:sz-cs w:val="24"/>
+        </w:rPr>
+        <w:t xml:space="preserve"/>
+      </w:r>
+    </w:p>
+    <w:p>
+      <w:pPr/>
+      <w:r>
+        <w:rPr>
+          <w:rFonts w:ascii="Helvetica Light" w:hAnsi="Helvetica Light" w:cs="Helvetica Light"/>
+          <w:sz w:val="24"/>
+          <w:sz-cs w:val="24"/>
+        </w:rPr>
+        <w:t xml:space="preserve">Update 2026-02-21 (Storefront System execution)</w:t>
+      </w:r>
+    </w:p>
+    <w:p>
+      <w:pPr/>
+      <w:r>
+        <w:rPr>
+          <w:rFonts w:ascii="Helvetica Light" w:hAnsi="Helvetica Light" w:cs="Helvetica Light"/>
+          <w:sz w:val="24"/>
+          <w:sz-cs w:val="24"/>
+        </w:rPr>
+        <w:t xml:space="preserve">- Completed major storefront theme overhaul with premium ecommerce experience:</w:t>
+      </w:r>
+    </w:p>
+    <w:p>
+      <w:pPr/>
+      <w:r>
+        <w:rPr>
+          <w:rFonts w:ascii="Helvetica Light" w:hAnsi="Helvetica Light" w:cs="Helvetica Light"/>
+          <w:sz w:val="24"/>
+          <w:sz-cs w:val="24"/>
+        </w:rPr>
+        <w:t xml:space="preserve">  - Home page: hero, categories, trending, promo strip.</w:t>
+      </w:r>
+    </w:p>
+    <w:p>
+      <w:pPr/>
+      <w:r>
+        <w:rPr>
+          <w:rFonts w:ascii="Helvetica Light" w:hAnsi="Helvetica Light" w:cs="Helvetica Light"/>
+          <w:sz w:val="24"/>
+          <w:sz-cs w:val="24"/>
+        </w:rPr>
+        <w:t xml:space="preserve">  - Product listing: filter sidebar + sorting + badges + quick actions.</w:t>
+      </w:r>
+    </w:p>
+    <w:p>
+      <w:pPr/>
+      <w:r>
+        <w:rPr>
+          <w:rFonts w:ascii="Helvetica Light" w:hAnsi="Helvetica Light" w:cs="Helvetica Light"/>
+          <w:sz w:val="24"/>
+          <w:sz-cs w:val="24"/>
+        </w:rPr>
+        <w:t xml:space="preserve">  - Product detail: gallery, variants, trust sections, buy flow.</w:t>
+      </w:r>
+    </w:p>
+    <w:p>
+      <w:pPr/>
+      <w:r>
+        <w:rPr>
+          <w:rFonts w:ascii="Helvetica Light" w:hAnsi="Helvetica Light" w:cs="Helvetica Light"/>
+          <w:sz w:val="24"/>
+          <w:sz-cs w:val="24"/>
+        </w:rPr>
+        <w:t xml:space="preserve">  - Cart &amp; checkout: modern summary, coupon, shipping method, payment selection.</w:t>
+      </w:r>
+    </w:p>
+    <w:p>
+      <w:pPr/>
+      <w:r>
+        <w:rPr>
+          <w:rFonts w:ascii="Helvetica Light" w:hAnsi="Helvetica Light" w:cs="Helvetica Light"/>
+          <w:sz w:val="24"/>
+          <w:sz-cs w:val="24"/>
+        </w:rPr>
+        <w:t xml:space="preserve">- Backend storefront data contract upgraded to support theme-grade rendering requirements (media/variant/stock/compare-at/status metadata).</w:t>
+      </w:r>
+    </w:p>
+    <w:p>
+      <w:pPr/>
+      <w:r>
+        <w:rPr>
+          <w:rFonts w:ascii="Helvetica Light" w:hAnsi="Helvetica Light" w:cs="Helvetica Light"/>
+          <w:sz w:val="24"/>
+          <w:sz-cs w:val="24"/>
+        </w:rPr>
+        <w:t xml:space="preserve"/>
+      </w:r>
+    </w:p>
+    <w:p>
+      <w:pPr/>
+      <w:r>
+        <w:rPr>
+          <w:rFonts w:ascii="Helvetica Light" w:hAnsi="Helvetica Light" w:cs="Helvetica Light"/>
+          <w:sz w:val="24"/>
+          <w:sz-cs w:val="24"/>
+        </w:rPr>
+        <w:t xml:space="preserve">Update 2026-02-21 (Storefront operational controls)</w:t>
+      </w:r>
+    </w:p>
+    <w:p>
+      <w:pPr/>
+      <w:r>
+        <w:rPr>
+          <w:rFonts w:ascii="Helvetica Light" w:hAnsi="Helvetica Light" w:cs="Helvetica Light"/>
+          <w:sz w:val="24"/>
+          <w:sz-cs w:val="24"/>
+        </w:rPr>
+        <w:t xml:space="preserve">- Added store-owner controlled offer and payment-mode behavior through storefront theme settings (`catalogVisibilityJson`).</w:t>
+      </w:r>
+    </w:p>
+    <w:p>
+      <w:pPr/>
+      <w:r>
+        <w:rPr>
+          <w:rFonts w:ascii="Helvetica Light" w:hAnsi="Helvetica Light" w:cs="Helvetica Light"/>
+          <w:sz w:val="24"/>
+          <w:sz-cs w:val="24"/>
+        </w:rPr>
+        <w:t xml:space="preserve">- Enforced store-scoped category rendering in storefront fallback navigation/featured sections.</w:t>
+      </w:r>
+    </w:p>
+    <w:p>
+      <w:pPr/>
+      <w:r>
+        <w:rPr>
+          <w:rFonts w:ascii="Helvetica Light" w:hAnsi="Helvetica Light" w:cs="Helvetica Light"/>
+          <w:sz w:val="24"/>
+          <w:sz-cs w:val="24"/>
+        </w:rPr>
+        <w:t xml:space="preserve">- Removed footer-level checkout strip to keep checkout CTA only in flow pages.</w:t>
+      </w:r>
+    </w:p>
+    <w:p>
+      <w:pPr/>
+      <w:r>
+        <w:rPr>
+          <w:rFonts w:ascii="Helvetica Light" w:hAnsi="Helvetica Light" w:cs="Helvetica Light"/>
+          <w:sz w:val="24"/>
+          <w:sz-cs w:val="24"/>
+        </w:rPr>
+        <w:t xml:space="preserve"/>
+      </w:r>
+    </w:p>
+    <w:p>
+      <w:pPr/>
+      <w:r>
+        <w:rPr>
+          <w:rFonts w:ascii="Helvetica Light" w:hAnsi="Helvetica Light" w:cs="Helvetica Light"/>
+          <w:sz w:val="24"/>
+          <w:sz-cs w:val="24"/>
+        </w:rPr>
+        <w:t xml:space="preserve">Update 2026-02-22 (Theme import pipeline usage)</w:t>
+      </w:r>
+    </w:p>
+    <w:p>
+      <w:pPr/>
+      <w:r>
+        <w:rPr>
+          <w:rFonts w:ascii="Helvetica Light" w:hAnsi="Helvetica Light" w:cs="Helvetica Light"/>
+          <w:sz w:val="24"/>
+          <w:sz-cs w:val="24"/>
+        </w:rPr>
+        <w:t xml:space="preserve">- Added real external fashion template package for platform import workflow testing and go-live onboarding.</w:t>
+      </w:r>
+    </w:p>
+    <w:p>
+      <w:pPr/>
+      <w:r>
+        <w:rPr>
+          <w:rFonts w:ascii="Helvetica Light" w:hAnsi="Helvetica Light" w:cs="Helvetica Light"/>
+          <w:sz w:val="24"/>
+          <w:sz-cs w:val="24"/>
+        </w:rPr>
+        <w:t xml:space="preserve">- Theme package follows mandatory manifest + assets structure and can be imported directly by Platform Owner.</w:t>
+      </w:r>
+    </w:p>
+    <w:p>
+      <w:pPr/>
+      <w:r>
+        <w:rPr>
+          <w:rFonts w:ascii="Helvetica Light" w:hAnsi="Helvetica Light" w:cs="Helvetica Light"/>
+          <w:sz w:val="24"/>
+          <w:sz-cs w:val="24"/>
+        </w:rPr>
+        <w:t xml:space="preserve"/>
+      </w:r>
+    </w:p>
+    <w:p>
+      <w:pPr/>
+      <w:r>
+        <w:rPr>
+          <w:rFonts w:ascii="Helvetica Light" w:hAnsi="Helvetica Light" w:cs="Helvetica Light"/>
+          <w:sz w:val="24"/>
+          <w:sz-cs w:val="24"/>
+        </w:rPr>
+        <w:t xml:space="preserve">Update 2026-02-22 (Theme preview safety)</w:t>
+      </w:r>
+    </w:p>
+    <w:p>
+      <w:pPr/>
+      <w:r>
+        <w:rPr>
+          <w:rFonts w:ascii="Helvetica Light" w:hAnsi="Helvetica Light" w:cs="Helvetica Light"/>
+          <w:sz w:val="24"/>
+          <w:sz-cs w:val="24"/>
+        </w:rPr>
+        <w:t xml:space="preserve">- Preview mode converted to read-only showroom behavior: all storefront pages are viewable, but order/quote/cart commit actions are blocked until theme is active/live.</w:t>
+      </w:r>
+    </w:p>
+    <w:p>
+      <w:pPr/>
+      <w:r>
+        <w:rPr>
+          <w:rFonts w:ascii="Helvetica Light" w:hAnsi="Helvetica Light" w:cs="Helvetica Light"/>
+          <w:sz w:val="24"/>
+          <w:sz-cs w:val="24"/>
+        </w:rPr>
+        <w:t xml:space="preserve"/>
+      </w:r>
+    </w:p>
+    <w:p>
+      <w:pPr/>
+      <w:r>
+        <w:rPr>
+          <w:rFonts w:ascii="Helvetica Light" w:hAnsi="Helvetica Light" w:cs="Helvetica Light"/>
+          <w:sz w:val="24"/>
+          <w:sz-cs w:val="24"/>
+        </w:rPr>
+        <w:t xml:space="preserve">Storefront Theme Runtime (Latest)</w:t>
+      </w:r>
+    </w:p>
+    <w:p>
+      <w:pPr/>
+      <w:r>
+        <w:rPr>
+          <w:rFonts w:ascii="Helvetica Light" w:hAnsi="Helvetica Light" w:cs="Helvetica Light"/>
+          <w:sz w:val="24"/>
+          <w:sz-cs w:val="24"/>
+        </w:rPr>
+        <w:t xml:space="preserve">- Developed: Theme import action/feedback, UI-first theme setting controls, runtime-pack driven storefront rendering differences.</w:t>
+      </w:r>
+    </w:p>
+    <w:p>
+      <w:pPr/>
+      <w:r>
+        <w:rPr>
+          <w:rFonts w:ascii="Helvetica Light" w:hAnsi="Helvetica Light" w:cs="Helvetica Light"/>
+          <w:sz w:val="24"/>
+          <w:sz-cs w:val="24"/>
+        </w:rPr>
+        <w:t xml:space="preserve">- Partial: Full isolated per-theme component runtime engine (true code-level theme package renderer) is not yet completed.</w:t>
+      </w:r>
+    </w:p>
+    <w:p>
+      <w:pPr/>
+      <w:r>
+        <w:rPr>
+          <w:rFonts w:ascii="Helvetica Light" w:hAnsi="Helvetica Light" w:cs="Helvetica Light"/>
+          <w:sz w:val="24"/>
+          <w:sz-cs w:val="24"/>
+        </w:rPr>
+        <w:t xml:space="preserve"/>
+      </w:r>
+    </w:p>
+    <w:p>
+      <w:pPr/>
+      <w:r>
+        <w:rPr>
+          <w:rFonts w:ascii="Helvetica Light" w:hAnsi="Helvetica Light" w:cs="Helvetica Light"/>
+          <w:sz w:val="24"/>
+          <w:sz-cs w:val="24"/>
+        </w:rPr>
+        <w:t xml:space="preserve">Theme Runtime Isolation</w:t>
+      </w:r>
+    </w:p>
+    <w:p>
+      <w:pPr/>
+      <w:r>
+        <w:rPr>
+          <w:rFonts w:ascii="Helvetica Light" w:hAnsi="Helvetica Light" w:cs="Helvetica Light"/>
+          <w:sz w:val="24"/>
+          <w:sz-cs w:val="24"/>
+        </w:rPr>
+        <w:t xml:space="preserve">- Developed: runtime resolver + isolated Kuzma renderer component for home/catalog/pdp.</w:t>
+      </w:r>
+    </w:p>
+    <w:p>
+      <w:pPr/>
+      <w:r>
+        <w:rPr>
+          <w:rFonts w:ascii="Helvetica Light" w:hAnsi="Helvetica Light" w:cs="Helvetica Light"/>
+          <w:sz w:val="24"/>
+          <w:sz-cs w:val="24"/>
+        </w:rPr>
+        <w:t xml:space="preserve">- Pending: isolate cart/checkout/login/page into per-theme runtime packs for full end-to-end isolation.</w:t>
+      </w:r>
+    </w:p>
+    <w:p>
+      <w:pPr/>
+      <w:r>
+        <w:rPr>
+          <w:rFonts w:ascii="Helvetica Light" w:hAnsi="Helvetica Light" w:cs="Helvetica Light"/>
+          <w:sz w:val="24"/>
+          <w:sz-cs w:val="24"/>
+        </w:rPr>
+        <w:t xml:space="preserve">- Developed: Kuzma isolated runtime now includes Home/Catalog/PDP/Cart/Checkout/Login/Page.</w:t>
+      </w:r>
+    </w:p>
+    <w:p>
+      <w:pPr/>
+      <w:r>
+        <w:rPr>
+          <w:rFonts w:ascii="Helvetica Light" w:hAnsi="Helvetica Light" w:cs="Helvetica Light"/>
+          <w:sz w:val="24"/>
+          <w:sz-cs w:val="24"/>
+        </w:rPr>
+        <w:t xml:space="preserve">- Pending: Build isolated runtime packs for each remaining theme slug to guarantee fully unique UI per theme.</w:t>
+      </w:r>
+    </w:p>
+    <w:p>
+      <w:pPr/>
+      <w:r>
+        <w:rPr>
+          <w:rFonts w:ascii="Helvetica Light" w:hAnsi="Helvetica Light" w:cs="Helvetica Light"/>
+          <w:sz w:val="24"/>
+          <w:sz-cs w:val="24"/>
+        </w:rPr>
+        <w:t xml:space="preserve">- Developed: Isolated runtime packs added for electronics-mega-store, grocery-fastcart, and luxury-signature (full key storefront pages).</w:t>
+      </w:r>
+    </w:p>
+    <w:p>
+      <w:pPr/>
+      <w:r>
+        <w:rPr>
+          <w:rFonts w:ascii="Helvetica Light" w:hAnsi="Helvetica Light" w:cs="Helvetica Light"/>
+          <w:sz w:val="24"/>
+          <w:sz-cs w:val="24"/>
+        </w:rPr>
+        <w:t xml:space="preserve">- Pending: Continue per-theme isolated runtime implementation for remaining theme slugs.</w:t>
+      </w:r>
+    </w:p>
+    <w:p>
+      <w:pPr/>
+      <w:r>
+        <w:rPr>
+          <w:rFonts w:ascii="Helvetica Light" w:hAnsi="Helvetica Light" w:cs="Helvetica Light"/>
+          <w:sz w:val="24"/>
+          <w:sz-cs w:val="24"/>
+        </w:rPr>
+        <w:t xml:space="preserve">- Developed: Unified commerce flow (cart/checkout/login/page) reused across themes; isolated theme runtime retained for home/catalog/pdp.</w:t>
+      </w:r>
+    </w:p>
+    <w:p>
+      <w:pPr/>
+      <w:r>
+        <w:rPr>
+          <w:rFonts w:ascii="Helvetica Light" w:hAnsi="Helvetica Light" w:cs="Helvetica Light"/>
+          <w:sz w:val="24"/>
+          <w:sz-cs w:val="24"/>
+        </w:rPr>
+        <w:t xml:space="preserve">- Developed: Add-to-cart toast feedback added at storefront level.</w:t>
+      </w:r>
+    </w:p>
+    <w:p>
+      <w:pPr/>
+      <w:r>
+        <w:rPr>
+          <w:rFonts w:ascii="Helvetica Light" w:hAnsi="Helvetica Light" w:cs="Helvetica Light"/>
+          <w:sz w:val="24"/>
+          <w:sz-cs w:val="24"/>
+        </w:rPr>
+        <w:t xml:space="preserve"/>
+      </w:r>
+    </w:p>
+    <w:p>
+      <w:pPr/>
+      <w:r>
+        <w:rPr>
+          <w:rFonts w:ascii="Helvetica Light" w:hAnsi="Helvetica Light" w:cs="Helvetica Light"/>
+          <w:sz w:val="24"/>
+          <w:sz-cs w:val="24"/>
+        </w:rPr>
+        <w:t xml:space="preserve">Update 2026-02-22 (Store Customer Module - Common Across All Stores)</w:t>
+      </w:r>
+    </w:p>
+    <w:p>
+      <w:pPr/>
+      <w:r>
+        <w:rPr>
+          <w:rFonts w:ascii="Helvetica Light" w:hAnsi="Helvetica Light" w:cs="Helvetica Light"/>
+          <w:sz w:val="24"/>
+          <w:sz-cs w:val="24"/>
+        </w:rPr>
+        <w:t xml:space="preserve">- Developed:</w:t>
+      </w:r>
+    </w:p>
+    <w:p>
+      <w:pPr/>
+      <w:r>
+        <w:rPr>
+          <w:rFonts w:ascii="Helvetica Light" w:hAnsi="Helvetica Light" w:cs="Helvetica Light"/>
+          <w:sz w:val="24"/>
+          <w:sz-cs w:val="24"/>
+        </w:rPr>
+        <w:t xml:space="preserve">  - Common customer account module implemented for all stores (single shared flow).</w:t>
+      </w:r>
+    </w:p>
+    <w:p>
+      <w:pPr/>
+      <w:r>
+        <w:rPr>
+          <w:rFonts w:ascii="Helvetica Light" w:hAnsi="Helvetica Light" w:cs="Helvetica Light"/>
+          <w:sz w:val="24"/>
+          <w:sz-cs w:val="24"/>
+        </w:rPr>
+        <w:t xml:space="preserve">  - Storefront account route added: `/s/{subdomain}/account`.</w:t>
+      </w:r>
+    </w:p>
+    <w:p>
+      <w:pPr/>
+      <w:r>
+        <w:rPr>
+          <w:rFonts w:ascii="Helvetica Light" w:hAnsi="Helvetica Light" w:cs="Helvetica Light"/>
+          <w:sz w:val="24"/>
+          <w:sz-cs w:val="24"/>
+        </w:rPr>
+        <w:t xml:space="preserve">  - Account UI follows active store theme tokens (primary color + font), and uses existing theme header/footer.</w:t>
+      </w:r>
+    </w:p>
+    <w:p>
+      <w:pPr/>
+      <w:r>
+        <w:rPr>
+          <w:rFonts w:ascii="Helvetica Light" w:hAnsi="Helvetica Light" w:cs="Helvetica Light"/>
+          <w:sz w:val="24"/>
+          <w:sz-cs w:val="24"/>
+        </w:rPr>
+        <w:t xml:space="preserve">  - Customer account sections added:</w:t>
+      </w:r>
+    </w:p>
+    <w:p>
+      <w:pPr/>
+      <w:r>
+        <w:rPr>
+          <w:rFonts w:ascii="Helvetica Light" w:hAnsi="Helvetica Light" w:cs="Helvetica Light"/>
+          <w:sz w:val="24"/>
+          <w:sz-cs w:val="24"/>
+        </w:rPr>
+        <w:t xml:space="preserve">    - Dashboard summary cards (orders, delivered, refunds, wishlist placeholder)</w:t>
+      </w:r>
+    </w:p>
+    <w:p>
+      <w:pPr/>
+      <w:r>
+        <w:rPr>
+          <w:rFonts w:ascii="Helvetica Light" w:hAnsi="Helvetica Light" w:cs="Helvetica Light"/>
+          <w:sz w:val="24"/>
+          <w:sz-cs w:val="24"/>
+        </w:rPr>
+        <w:t xml:space="preserve">    - Orders list + order details</w:t>
+      </w:r>
+    </w:p>
+    <w:p>
+      <w:pPr/>
+      <w:r>
+        <w:rPr>
+          <w:rFonts w:ascii="Helvetica Light" w:hAnsi="Helvetica Light" w:cs="Helvetica Light"/>
+          <w:sz w:val="24"/>
+          <w:sz-cs w:val="24"/>
+        </w:rPr>
+        <w:t xml:space="preserve">    - Tracking timeline</w:t>
+      </w:r>
+    </w:p>
+    <w:p>
+      <w:pPr/>
+      <w:r>
+        <w:rPr>
+          <w:rFonts w:ascii="Helvetica Light" w:hAnsi="Helvetica Light" w:cs="Helvetica Light"/>
+          <w:sz w:val="24"/>
+          <w:sz-cs w:val="24"/>
+        </w:rPr>
+        <w:t xml:space="preserve">    - Refund request form</w:t>
+      </w:r>
+    </w:p>
+    <w:p>
+      <w:pPr/>
+      <w:r>
+        <w:rPr>
+          <w:rFonts w:ascii="Helvetica Light" w:hAnsi="Helvetica Light" w:cs="Helvetica Light"/>
+          <w:sz w:val="24"/>
+          <w:sz-cs w:val="24"/>
+        </w:rPr>
+        <w:t xml:space="preserve">    - Support ticket form</w:t>
+      </w:r>
+    </w:p>
+    <w:p>
+      <w:pPr/>
+      <w:r>
+        <w:rPr>
+          <w:rFonts w:ascii="Helvetica Light" w:hAnsi="Helvetica Light" w:cs="Helvetica Light"/>
+          <w:sz w:val="24"/>
+          <w:sz-cs w:val="24"/>
+        </w:rPr>
+        <w:t xml:space="preserve">    - Saved addresses</w:t>
+      </w:r>
+    </w:p>
+    <w:p>
+      <w:pPr/>
+      <w:r>
+        <w:rPr>
+          <w:rFonts w:ascii="Helvetica Light" w:hAnsi="Helvetica Light" w:cs="Helvetica Light"/>
+          <w:sz w:val="24"/>
+          <w:sz-cs w:val="24"/>
+        </w:rPr>
+        <w:t xml:space="preserve">- Developed backend APIs for customer account operations:</w:t>
+      </w:r>
+    </w:p>
+    <w:p>
+      <w:pPr/>
+      <w:r>
+        <w:rPr>
+          <w:rFonts w:ascii="Helvetica Light" w:hAnsi="Helvetica Light" w:cs="Helvetica Light"/>
+          <w:sz w:val="24"/>
+          <w:sz-cs w:val="24"/>
+        </w:rPr>
+        <w:t xml:space="preserve">  - `GET /api/public/storefront/{subdomain}/customer/account-summary`</w:t>
+      </w:r>
+    </w:p>
+    <w:p>
+      <w:pPr/>
+      <w:r>
+        <w:rPr>
+          <w:rFonts w:ascii="Helvetica Light" w:hAnsi="Helvetica Light" w:cs="Helvetica Light"/>
+          <w:sz w:val="24"/>
+          <w:sz-cs w:val="24"/>
+        </w:rPr>
+        <w:t xml:space="preserve">  - `POST /api/public/storefront/{subdomain}/customer/orders/{orderId}/refund-request`</w:t>
+      </w:r>
+    </w:p>
+    <w:p>
+      <w:pPr/>
+      <w:r>
+        <w:rPr>
+          <w:rFonts w:ascii="Helvetica Light" w:hAnsi="Helvetica Light" w:cs="Helvetica Light"/>
+          <w:sz w:val="24"/>
+          <w:sz-cs w:val="24"/>
+        </w:rPr>
+        <w:t xml:space="preserve">  - `POST /api/public/storefront/{subdomain}/customer/support-ticket`</w:t>
+      </w:r>
+    </w:p>
+    <w:p>
+      <w:pPr/>
+      <w:r>
+        <w:rPr>
+          <w:rFonts w:ascii="Helvetica Light" w:hAnsi="Helvetica Light" w:cs="Helvetica Light"/>
+          <w:sz w:val="24"/>
+          <w:sz-cs w:val="24"/>
+        </w:rPr>
+        <w:t xml:space="preserve">- Security:</w:t>
+      </w:r>
+    </w:p>
+    <w:p>
+      <w:pPr/>
+      <w:r>
+        <w:rPr>
+          <w:rFonts w:ascii="Helvetica Light" w:hAnsi="Helvetica Light" w:cs="Helvetica Light"/>
+          <w:sz w:val="24"/>
+          <w:sz-cs w:val="24"/>
+        </w:rPr>
+        <w:t xml:space="preserve">  - APIs are cookie-session authenticated (`sf_customer_session`) and store-scoped.</w:t>
+      </w:r>
+    </w:p>
+    <w:p>
+      <w:pPr/>
+      <w:r>
+        <w:rPr>
+          <w:rFonts w:ascii="Helvetica Light" w:hAnsi="Helvetica Light" w:cs="Helvetica Light"/>
+          <w:sz w:val="24"/>
+          <w:sz-cs w:val="24"/>
+        </w:rPr>
+        <w:t xml:space="preserve">  - Refund/ticket actions are recorded in audit logs.</w:t>
+      </w:r>
+    </w:p>
+    <w:p>
+      <w:pPr/>
+      <w:r>
+        <w:rPr>
+          <w:rFonts w:ascii="Helvetica Light" w:hAnsi="Helvetica Light" w:cs="Helvetica Light"/>
+          <w:sz w:val="24"/>
+          <w:sz-cs w:val="24"/>
+        </w:rPr>
+        <w:t xml:space="preserve">- Architecture:</w:t>
+      </w:r>
+    </w:p>
+    <w:p>
+      <w:pPr/>
+      <w:r>
+        <w:rPr>
+          <w:rFonts w:ascii="Helvetica Light" w:hAnsi="Helvetica Light" w:cs="Helvetica Light"/>
+          <w:sz w:val="24"/>
+          <w:sz-cs w:val="24"/>
+        </w:rPr>
+        <w:t xml:space="preserve">  - This module is shared/common across themes (no per-theme duplication).</w:t>
+      </w:r>
+    </w:p>
+    <w:p>
+      <w:pPr/>
+      <w:r>
+        <w:rPr>
+          <w:rFonts w:ascii="Helvetica Light" w:hAnsi="Helvetica Light" w:cs="Helvetica Light"/>
+          <w:sz w:val="24"/>
+          <w:sz-cs w:val="24"/>
+        </w:rPr>
+        <w:t xml:space="preserve">  - Existing isolated theme runtime remains for Home/Catalog/PDP only.</w:t>
       </w:r>
     </w:p>
     <w:sectPr/>

</xml_diff>

<commit_message>
Add free SS-Simple theme runtime with store color presets
</commit_message>
<xml_diff>
--- a/masterrequirement.docx
+++ b/masterrequirement.docx
@@ -7790,6 +7790,138 @@
           <w:sz-cs w:val="24"/>
         </w:rPr>
         <w:t xml:space="preserve">  - Existing isolated theme runtime remains for Home/Catalog/PDP only.</w:t>
+      </w:r>
+    </w:p>
+    <w:p>
+      <w:pPr/>
+      <w:r>
+        <w:rPr>
+          <w:rFonts w:ascii="Helvetica Light" w:hAnsi="Helvetica Light" w:cs="Helvetica Light"/>
+          <w:sz w:val="24"/>
+          <w:sz-cs w:val="24"/>
+        </w:rPr>
+        <w:t xml:space="preserve"/>
+      </w:r>
+    </w:p>
+    <w:p>
+      <w:pPr/>
+      <w:r>
+        <w:rPr>
+          <w:rFonts w:ascii="Helvetica Light" w:hAnsi="Helvetica Light" w:cs="Helvetica Light"/>
+          <w:sz w:val="24"/>
+          <w:sz-cs w:val="24"/>
+        </w:rPr>
+        <w:t xml:space="preserve">Update 2026-02-22 (Theme Expansion: SS-Simple)</w:t>
+      </w:r>
+    </w:p>
+    <w:p>
+      <w:pPr/>
+      <w:r>
+        <w:rPr>
+          <w:rFonts w:ascii="Helvetica Light" w:hAnsi="Helvetica Light" w:cs="Helvetica Light"/>
+          <w:sz w:val="24"/>
+          <w:sz-cs w:val="24"/>
+        </w:rPr>
+        <w:t xml:space="preserve">- Developed new free theme: `SS-Simple` (Fashion/Apparel category).</w:t>
+      </w:r>
+    </w:p>
+    <w:p>
+      <w:pPr/>
+      <w:r>
+        <w:rPr>
+          <w:rFonts w:ascii="Helvetica Light" w:hAnsi="Helvetica Light" w:cs="Helvetica Light"/>
+          <w:sz w:val="24"/>
+          <w:sz-cs w:val="24"/>
+        </w:rPr>
+        <w:t xml:space="preserve">- Implemented dedicated runtime pack for:</w:t>
+      </w:r>
+    </w:p>
+    <w:p>
+      <w:pPr/>
+      <w:r>
+        <w:rPr>
+          <w:rFonts w:ascii="Helvetica Light" w:hAnsi="Helvetica Light" w:cs="Helvetica Light"/>
+          <w:sz w:val="24"/>
+          <w:sz-cs w:val="24"/>
+        </w:rPr>
+        <w:t xml:space="preserve">  - Landing/Catalog style page (hero + filter sidebar + product grid)</w:t>
+      </w:r>
+    </w:p>
+    <w:p>
+      <w:pPr/>
+      <w:r>
+        <w:rPr>
+          <w:rFonts w:ascii="Helvetica Light" w:hAnsi="Helvetica Light" w:cs="Helvetica Light"/>
+          <w:sz w:val="24"/>
+          <w:sz-cs w:val="24"/>
+        </w:rPr>
+        <w:t xml:space="preserve">  - Product detail page (gallery, size, color, pricing, add to cart/buy now)</w:t>
+      </w:r>
+    </w:p>
+    <w:p>
+      <w:pPr/>
+      <w:r>
+        <w:rPr>
+          <w:rFonts w:ascii="Helvetica Light" w:hAnsi="Helvetica Light" w:cs="Helvetica Light"/>
+          <w:sz w:val="24"/>
+          <w:sz-cs w:val="24"/>
+        </w:rPr>
+        <w:t xml:space="preserve">- Theme integration:</w:t>
+      </w:r>
+    </w:p>
+    <w:p>
+      <w:pPr/>
+      <w:r>
+        <w:rPr>
+          <w:rFonts w:ascii="Helvetica Light" w:hAnsi="Helvetica Light" w:cs="Helvetica Light"/>
+          <w:sz w:val="24"/>
+          <w:sz-cs w:val="24"/>
+        </w:rPr>
+        <w:t xml:space="preserve">  - Routed by slug through theme runtime resolver.</w:t>
+      </w:r>
+    </w:p>
+    <w:p>
+      <w:pPr/>
+      <w:r>
+        <w:rPr>
+          <w:rFonts w:ascii="Helvetica Light" w:hAnsi="Helvetica Light" w:cs="Helvetica Light"/>
+          <w:sz w:val="24"/>
+          <w:sz-cs w:val="24"/>
+        </w:rPr>
+        <w:t xml:space="preserve">  - Uses common platform cart/checkout/login/account flows.</w:t>
+      </w:r>
+    </w:p>
+    <w:p>
+      <w:pPr/>
+      <w:r>
+        <w:rPr>
+          <w:rFonts w:ascii="Helvetica Light" w:hAnsi="Helvetica Light" w:cs="Helvetica Light"/>
+          <w:sz w:val="24"/>
+          <w:sz-cs w:val="24"/>
+        </w:rPr>
+        <w:t xml:space="preserve">- Branding/Customization:</w:t>
+      </w:r>
+    </w:p>
+    <w:p>
+      <w:pPr/>
+      <w:r>
+        <w:rPr>
+          <w:rFonts w:ascii="Helvetica Light" w:hAnsi="Helvetica Light" w:cs="Helvetica Light"/>
+          <w:sz w:val="24"/>
+          <w:sz-cs w:val="24"/>
+        </w:rPr>
+        <w:t xml:space="preserve">  - Store owner can change color using design tokens.</w:t>
+      </w:r>
+    </w:p>
+    <w:p>
+      <w:pPr/>
+      <w:r>
+        <w:rPr>
+          <w:rFonts w:ascii="Helvetica Light" w:hAnsi="Helvetica Light" w:cs="Helvetica Light"/>
+          <w:sz w:val="24"/>
+          <w:sz-cs w:val="24"/>
+        </w:rPr>
+        <w:t xml:space="preserve">  - Added SS-Simple quick color presets in Store Builder with one-click apply.</w:t>
       </w:r>
     </w:p>
     <w:sectPr/>

</xml_diff>

<commit_message>
Add checkout template selection with shared checkout engine
</commit_message>
<xml_diff>
--- a/masterrequirement.docx
+++ b/masterrequirement.docx
@@ -7922,6 +7922,160 @@
           <w:sz-cs w:val="24"/>
         </w:rPr>
         <w:t xml:space="preserve">  - Added SS-Simple quick color presets in Store Builder with one-click apply.</w:t>
+      </w:r>
+    </w:p>
+    <w:p>
+      <w:pPr/>
+      <w:r>
+        <w:rPr>
+          <w:rFonts w:ascii="Helvetica Light" w:hAnsi="Helvetica Light" w:cs="Helvetica Light"/>
+          <w:sz w:val="24"/>
+          <w:sz-cs w:val="24"/>
+        </w:rPr>
+        <w:t xml:space="preserve"/>
+      </w:r>
+    </w:p>
+    <w:p>
+      <w:pPr/>
+      <w:r>
+        <w:rPr>
+          <w:rFonts w:ascii="Helvetica Light" w:hAnsi="Helvetica Light" w:cs="Helvetica Light"/>
+          <w:sz w:val="24"/>
+          <w:sz-cs w:val="24"/>
+        </w:rPr>
+        <w:t xml:space="preserve">Update 2026-02-22 (Checkout Template Selection - Compatible + Low Weight)</w:t>
+      </w:r>
+    </w:p>
+    <w:p>
+      <w:pPr/>
+      <w:r>
+        <w:rPr>
+          <w:rFonts w:ascii="Helvetica Light" w:hAnsi="Helvetica Light" w:cs="Helvetica Light"/>
+          <w:sz w:val="24"/>
+          <w:sz-cs w:val="24"/>
+        </w:rPr>
+        <w:t xml:space="preserve">- Added compatibility layer for separate checkout template selection independent from storefront theme.</w:t>
+      </w:r>
+    </w:p>
+    <w:p>
+      <w:pPr/>
+      <w:r>
+        <w:rPr>
+          <w:rFonts w:ascii="Helvetica Light" w:hAnsi="Helvetica Light" w:cs="Helvetica Light"/>
+          <w:sz w:val="24"/>
+          <w:sz-cs w:val="24"/>
+        </w:rPr>
+        <w:t xml:space="preserve">- Current model:</w:t>
+      </w:r>
+    </w:p>
+    <w:p>
+      <w:pPr/>
+      <w:r>
+        <w:rPr>
+          <w:rFonts w:ascii="Helvetica Light" w:hAnsi="Helvetica Light" w:cs="Helvetica Light"/>
+          <w:sz w:val="24"/>
+          <w:sz-cs w:val="24"/>
+        </w:rPr>
+        <w:t xml:space="preserve">  - Theme controls landing/catalog/pdp style.</w:t>
+      </w:r>
+    </w:p>
+    <w:p>
+      <w:pPr/>
+      <w:r>
+        <w:rPr>
+          <w:rFonts w:ascii="Helvetica Light" w:hAnsi="Helvetica Light" w:cs="Helvetica Light"/>
+          <w:sz w:val="24"/>
+          <w:sz-cs w:val="24"/>
+        </w:rPr>
+        <w:t xml:space="preserve">  - Checkout template controls checkout UI variant.</w:t>
+      </w:r>
+    </w:p>
+    <w:p>
+      <w:pPr/>
+      <w:r>
+        <w:rPr>
+          <w:rFonts w:ascii="Helvetica Light" w:hAnsi="Helvetica Light" w:cs="Helvetica Light"/>
+          <w:sz w:val="24"/>
+          <w:sz-cs w:val="24"/>
+        </w:rPr>
+        <w:t xml:space="preserve">  - Order/payment/business validations remain common backend engine.</w:t>
+      </w:r>
+    </w:p>
+    <w:p>
+      <w:pPr/>
+      <w:r>
+        <w:rPr>
+          <w:rFonts w:ascii="Helvetica Light" w:hAnsi="Helvetica Light" w:cs="Helvetica Light"/>
+          <w:sz w:val="24"/>
+          <w:sz-cs w:val="24"/>
+        </w:rPr>
+        <w:t xml:space="preserve">- Implemented backend support:</w:t>
+      </w:r>
+    </w:p>
+    <w:p>
+      <w:pPr/>
+      <w:r>
+        <w:rPr>
+          <w:rFonts w:ascii="Helvetica Light" w:hAnsi="Helvetica Light" w:cs="Helvetica Light"/>
+          <w:sz w:val="24"/>
+          <w:sz-cs w:val="24"/>
+        </w:rPr>
+        <w:t xml:space="preserve">  - Settings fields: `CheckoutTemplateSlug`, `CheckoutTemplateConfigJson`.</w:t>
+      </w:r>
+    </w:p>
+    <w:p>
+      <w:pPr/>
+      <w:r>
+        <w:rPr>
+          <w:rFonts w:ascii="Helvetica Light" w:hAnsi="Helvetica Light" w:cs="Helvetica Light"/>
+          <w:sz w:val="24"/>
+          <w:sz-cs w:val="24"/>
+        </w:rPr>
+        <w:t xml:space="preserve">  - Store owner endpoints to list/apply templates.</w:t>
+      </w:r>
+    </w:p>
+    <w:p>
+      <w:pPr/>
+      <w:r>
+        <w:rPr>
+          <w:rFonts w:ascii="Helvetica Light" w:hAnsi="Helvetica Light" w:cs="Helvetica Light"/>
+          <w:sz w:val="24"/>
+          <w:sz-cs w:val="24"/>
+        </w:rPr>
+        <w:t xml:space="preserve">- Implemented frontend support:</w:t>
+      </w:r>
+    </w:p>
+    <w:p>
+      <w:pPr/>
+      <w:r>
+        <w:rPr>
+          <w:rFonts w:ascii="Helvetica Light" w:hAnsi="Helvetica Light" w:cs="Helvetica Light"/>
+          <w:sz w:val="24"/>
+          <w:sz-cs w:val="24"/>
+        </w:rPr>
+        <w:t xml:space="preserve">  - Store Builder selector for checkout template.</w:t>
+      </w:r>
+    </w:p>
+    <w:p>
+      <w:pPr/>
+      <w:r>
+        <w:rPr>
+          <w:rFonts w:ascii="Helvetica Light" w:hAnsi="Helvetica Light" w:cs="Helvetica Light"/>
+          <w:sz w:val="24"/>
+          <w:sz-cs w:val="24"/>
+        </w:rPr>
+        <w:t xml:space="preserve">  - Storefront checkout reads active template slug and applies variant styling.</w:t>
+      </w:r>
+    </w:p>
+    <w:p>
+      <w:pPr/>
+      <w:r>
+        <w:rPr>
+          <w:rFonts w:ascii="Helvetica Light" w:hAnsi="Helvetica Light" w:cs="Helvetica Light"/>
+          <w:sz w:val="24"/>
+          <w:sz-cs w:val="24"/>
+        </w:rPr>
+        <w:t xml:space="preserve">- Kept implementation lightweight to avoid runtime duplication.</w:t>
       </w:r>
     </w:p>
     <w:sectPr/>

</xml_diff>

<commit_message>
Slim checkout template contract for lightweight runtime
</commit_message>
<xml_diff>
--- a/masterrequirement.docx
+++ b/masterrequirement.docx
@@ -8076,6 +8076,61 @@
           <w:sz-cs w:val="24"/>
         </w:rPr>
         <w:t xml:space="preserve">- Kept implementation lightweight to avoid runtime duplication.</w:t>
+      </w:r>
+    </w:p>
+    <w:p>
+      <w:pPr/>
+      <w:r>
+        <w:rPr>
+          <w:rFonts w:ascii="Helvetica Light" w:hAnsi="Helvetica Light" w:cs="Helvetica Light"/>
+          <w:sz w:val="24"/>
+          <w:sz-cs w:val="24"/>
+        </w:rPr>
+        <w:t xml:space="preserve"/>
+      </w:r>
+    </w:p>
+    <w:p>
+      <w:pPr/>
+      <w:r>
+        <w:rPr>
+          <w:rFonts w:ascii="Helvetica Light" w:hAnsi="Helvetica Light" w:cs="Helvetica Light"/>
+          <w:sz w:val="24"/>
+          <w:sz-cs w:val="24"/>
+        </w:rPr>
+        <w:t xml:space="preserve">Update 2026-02-22 (Code Weight Optimization)</w:t>
+      </w:r>
+    </w:p>
+    <w:p>
+      <w:pPr/>
+      <w:r>
+        <w:rPr>
+          <w:rFonts w:ascii="Helvetica Light" w:hAnsi="Helvetica Light" w:cs="Helvetica Light"/>
+          <w:sz w:val="24"/>
+          <w:sz-cs w:val="24"/>
+        </w:rPr>
+        <w:t xml:space="preserve">- Checkout template feature simplified to use only `CheckoutTemplateSlug`.</w:t>
+      </w:r>
+    </w:p>
+    <w:p>
+      <w:pPr/>
+      <w:r>
+        <w:rPr>
+          <w:rFonts w:ascii="Helvetica Light" w:hAnsi="Helvetica Light" w:cs="Helvetica Light"/>
+          <w:sz w:val="24"/>
+          <w:sz-cs w:val="24"/>
+        </w:rPr>
+        <w:t xml:space="preserve">- Removed unused configuration JSON plumbing from backend model/request and frontend store settings state.</w:t>
+      </w:r>
+    </w:p>
+    <w:p>
+      <w:pPr/>
+      <w:r>
+        <w:rPr>
+          <w:rFonts w:ascii="Helvetica Light" w:hAnsi="Helvetica Light" w:cs="Helvetica Light"/>
+          <w:sz w:val="24"/>
+          <w:sz-cs w:val="24"/>
+        </w:rPr>
+        <w:t xml:space="preserve">- Net effect: lighter payload, lower code complexity, same functionality for selecting checkout style.</w:t>
       </w:r>
     </w:p>
     <w:sectPr/>

</xml_diff>

<commit_message>
Remove Store Builder module from frontend backend and platform owner
</commit_message>
<xml_diff>
--- a/masterrequirement.docx
+++ b/masterrequirement.docx
@@ -8131,6 +8131,105 @@
           <w:sz-cs w:val="24"/>
         </w:rPr>
         <w:t xml:space="preserve">- Net effect: lighter payload, lower code complexity, same functionality for selecting checkout style.</w:t>
+      </w:r>
+    </w:p>
+    <w:p>
+      <w:pPr/>
+      <w:r>
+        <w:rPr>
+          <w:rFonts w:ascii="Helvetica Light" w:hAnsi="Helvetica Light" w:cs="Helvetica Light"/>
+          <w:sz w:val="24"/>
+          <w:sz-cs w:val="24"/>
+        </w:rPr>
+        <w:t xml:space="preserve"/>
+      </w:r>
+    </w:p>
+    <w:p>
+      <w:pPr/>
+      <w:r>
+        <w:rPr>
+          <w:rFonts w:ascii="Helvetica Light" w:hAnsi="Helvetica Light" w:cs="Helvetica Light"/>
+          <w:sz w:val="24"/>
+          <w:sz-cs w:val="24"/>
+        </w:rPr>
+        <w:t xml:space="preserve">Update 2026-02-22 (Store Builder Reset)</w:t>
+      </w:r>
+    </w:p>
+    <w:p>
+      <w:pPr/>
+      <w:r>
+        <w:rPr>
+          <w:rFonts w:ascii="Helvetica Light" w:hAnsi="Helvetica Light" w:cs="Helvetica Light"/>
+          <w:sz w:val="24"/>
+          <w:sz-cs w:val="24"/>
+        </w:rPr>
+        <w:t xml:space="preserve">- As requested, removed complete Store Builder implementation from:</w:t>
+      </w:r>
+    </w:p>
+    <w:p>
+      <w:pPr/>
+      <w:r>
+        <w:rPr>
+          <w:rFonts w:ascii="Helvetica Light" w:hAnsi="Helvetica Light" w:cs="Helvetica Light"/>
+          <w:sz w:val="24"/>
+          <w:sz-cs w:val="24"/>
+        </w:rPr>
+        <w:t xml:space="preserve">  - Frontend store owner module</w:t>
+      </w:r>
+    </w:p>
+    <w:p>
+      <w:pPr/>
+      <w:r>
+        <w:rPr>
+          <w:rFonts w:ascii="Helvetica Light" w:hAnsi="Helvetica Light" w:cs="Helvetica Light"/>
+          <w:sz w:val="24"/>
+          <w:sz-cs w:val="24"/>
+        </w:rPr>
+        <w:t xml:space="preserve">  - Platform owner module (Platform Themes)</w:t>
+      </w:r>
+    </w:p>
+    <w:p>
+      <w:pPr/>
+      <w:r>
+        <w:rPr>
+          <w:rFonts w:ascii="Helvetica Light" w:hAnsi="Helvetica Light" w:cs="Helvetica Light"/>
+          <w:sz w:val="24"/>
+          <w:sz-cs w:val="24"/>
+        </w:rPr>
+        <w:t xml:space="preserve">  - Backend management APIs/controller</w:t>
+      </w:r>
+    </w:p>
+    <w:p>
+      <w:pPr/>
+      <w:r>
+        <w:rPr>
+          <w:rFonts w:ascii="Helvetica Light" w:hAnsi="Helvetica Light" w:cs="Helvetica Light"/>
+          <w:sz w:val="24"/>
+          <w:sz-cs w:val="24"/>
+        </w:rPr>
+        <w:t xml:space="preserve">- Removed related realtime collaboration service/websocket wiring.</w:t>
+      </w:r>
+    </w:p>
+    <w:p>
+      <w:pPr/>
+      <w:r>
+        <w:rPr>
+          <w:rFonts w:ascii="Helvetica Light" w:hAnsi="Helvetica Light" w:cs="Helvetica Light"/>
+          <w:sz w:val="24"/>
+          <w:sz-cs w:val="24"/>
+        </w:rPr>
+        <w:t xml:space="preserve">- Public storefront rendering and customer checkout/account runtime kept operational.</w:t>
+      </w:r>
+    </w:p>
+    <w:p>
+      <w:pPr/>
+      <w:r>
+        <w:rPr>
+          <w:rFonts w:ascii="Helvetica Light" w:hAnsi="Helvetica Light" w:cs="Helvetica Light"/>
+          <w:sz w:val="24"/>
+          <w:sz-cs w:val="24"/>
+        </w:rPr>
+        <w:t xml:space="preserve">- This creates a clean baseline for implementing new Store Builder logic later.</w:t>
       </w:r>
     </w:p>
     <w:sectPr/>

</xml_diff>